<commit_message>
Name Rada Nadzorcza explicitly as organ właściwy in skargi na organy (§4)
Neither ust. 1 nor ust. 2 named which body "organ właściwy" actually
is. ust. 1 (skargi na Zarząd) now cites the direct statutory basis
(Statut § 49 ust. 1 pkt 7 - RN rozpatruje skargi na Zarząd). ust. 2
(skargi na członka Rady) had no equivalent direct statutory citation
to find (checked the whole statut and regulamin Rady Nadzorczej - only
§49 pkt7 uses the word "skargi" at all) - names Rada Nadzorcza per the
user's explicit call, as the natural reading by analogy to ust. 1 and
to Regulamin RN §24's general duty to answer members' skargi, with
self-exclusion of the concerned member.

Co-Authored-By: Claude Sonnet 5 <noreply@anthropic.com>
</commit_message>
<xml_diff>
--- a/projekty/04_Procedura_skarg_i_wnioskow.docx
+++ b/projekty/04_Procedura_skarg_i_wnioskow.docx
@@ -113,12 +113,12 @@
     </w:p>
     <w:p>
       <w:r>
-        <w:t>1. Skargi na Zarząd rozpatruje organ właściwy zgodnie ze Statutem i prawem.</w:t>
+        <w:t>1. Skargi na Zarząd rozpatruje organ właściwy, czyli Rada Nadzorcza (Statut § 49 ust. 1 pkt 7).</w:t>
       </w:r>
     </w:p>
     <w:p>
       <w:r>
-        <w:t>2. Skargi na członka Rady rozpatruje organ właściwy, z wyłączeniem zainteresowanego.</w:t>
+        <w:t>2. Skargi na członka Rady rozpatruje organ właściwy, czyli Rada Nadzorcza, z wyłączeniem zainteresowanego.</w:t>
       </w:r>
     </w:p>
     <w:p>

</xml_diff>